<commit_message>
Generalize docs and examples for nebula3d
</commit_message>
<xml_diff>
--- a/docs/nebula3d_manual.docx
+++ b/docs/nebula3d_manual.docx
@@ -80,7 +80,7 @@
                 <w:sz w:val="100"/>
                 <w:szCs w:val="100"/>
               </w:rPr>
-              <w:t xml:space="preserve">neutron-diffuse</w:t>
+              <w:t xml:space="preserve">nebula3d</w:t>
             </w:r>
           </w:p>
           <w:p>
@@ -557,45 +557,7 @@
                 <w:sz w:val="19"/>
                 <w:szCs w:val="19"/>
               </w:rPr>
-              <w:t xml:space="preserve">TbTi</w:t>
-            </w:r>
-            <w:r>
-              <w:rPr>
-                <w:rFonts w:ascii="Arial" w:cs="Arial" w:eastAsia="Arial" w:hAnsi="Arial"/>
-                <w:color w:val="1C1F26"/>
-                <w:sz w:val="19"/>
-                <w:szCs w:val="19"/>
-                <w:vertAlign w:val="subscript"/>
-              </w:rPr>
-              <w:t xml:space="preserve">3</w:t>
-            </w:r>
-            <w:r>
-              <w:rPr>
-                <w:rFonts w:ascii="Arial" w:cs="Arial" w:eastAsia="Arial" w:hAnsi="Arial"/>
-                <w:color w:val="1C1F26"/>
-                <w:sz w:val="19"/>
-                <w:szCs w:val="19"/>
-              </w:rPr>
-              <w:t xml:space="preserve">Bi</w:t>
-            </w:r>
-            <w:r>
-              <w:rPr>
-                <w:rFonts w:ascii="Arial" w:cs="Arial" w:eastAsia="Arial" w:hAnsi="Arial"/>
-                <w:color w:val="1C1F26"/>
-                <w:sz w:val="19"/>
-                <w:szCs w:val="19"/>
-                <w:vertAlign w:val="subscript"/>
-              </w:rPr>
-              <w:t xml:space="preserve">4</w:t>
-            </w:r>
-            <w:r>
-              <w:rPr>
-                <w:rFonts w:ascii="Arial" w:cs="Arial" w:eastAsia="Arial" w:hAnsi="Arial"/>
-                <w:color w:val="1C1F26"/>
-                <w:sz w:val="19"/>
-                <w:szCs w:val="19"/>
-              </w:rPr>
-              <w:t xml:space="preserve">   (22 K / 45 K / 100 K)</w:t>
+              <w:t xml:space="preserve">Mantid NeXus HKL volumes</w:t>
             </w:r>
           </w:p>
         </w:tc>
@@ -806,7 +768,7 @@
           <w:sz w:val="21"/>
           <w:szCs w:val="21"/>
         </w:rPr>
-        <w:t xml:space="preserve">neutron-diffuse</w:t>
+        <w:t xml:space="preserve">nebula3d</w:t>
       </w:r>
       <w:r>
         <w:rPr>
@@ -1468,7 +1430,7 @@
           <w:sz w:val="21"/>
           <w:szCs w:val="21"/>
         </w:rPr>
-        <w:t xml:space="preserve">This manual covers the background physics and mathematics of 3D diffuse scattering analysis, the algorithms and their theoretical basis, a step-by-step workflow, the Python API, every configuration parameter, worked examples for the reference TbTi₃Bi₄ dataset at 22 K / 45 K / 100 K, interactive visualization, known limitations, and a complete reference list.</w:t>
+        <w:t xml:space="preserve">This manual covers the background physics and mathematics of 3D diffuse scattering analysis, the algorithms and their theoretical basis, a step-by-step workflow, the Python API, every configuration parameter, generic worked examples for single-volume and multi-volume workflows, interactive visualization, known limitations, and a complete reference list.</w:t>
       </w:r>
     </w:p>
     <w:p>
@@ -1495,7 +1457,7 @@
           <w:sz w:val="28"/>
           <w:szCs w:val="28"/>
         </w:rPr>
-        <w:t xml:space="preserve">What neutron-diffuse Does Not Do</w:t>
+        <w:t xml:space="preserve">What nebula3d Does Not Do</w:t>
       </w:r>
     </w:p>
     <w:p>
@@ -2247,7 +2209,7 @@
           <w:sz w:val="21"/>
           <w:szCs w:val="21"/>
         </w:rPr>
-        <w:t xml:space="preserve">Combines orientation U and reciprocal metric B. Mantid stores the crystallographic UB (no 2π); ndiff multiplies by 2π on read.</w:t>
+        <w:t xml:space="preserve">Combines orientation U and reciprocal metric B. Mantid stores the crystallographic UB (no 2π); nebula3d multiplies by 2π on read.</w:t>
       </w:r>
     </w:p>
     <w:tbl>
@@ -2659,7 +2621,7 @@
                 <w:sz w:val="18"/>
                 <w:szCs w:val="18"/>
               </w:rPr>
-              <w:t xml:space="preserve">ndiff/core.py</w:t>
+              <w:t xml:space="preserve">nebula3d/core.py</w:t>
             </w:r>
           </w:p>
         </w:tc>
@@ -2727,7 +2689,7 @@
                 <w:sz w:val="18"/>
                 <w:szCs w:val="18"/>
               </w:rPr>
-              <w:t xml:space="preserve">ndiff/io/</w:t>
+              <w:t xml:space="preserve">nebula3d/io/</w:t>
             </w:r>
           </w:p>
         </w:tc>
@@ -2795,7 +2757,7 @@
                 <w:sz w:val="18"/>
                 <w:szCs w:val="18"/>
               </w:rPr>
-              <w:t xml:space="preserve">ndiff/preprocessing/</w:t>
+              <w:t xml:space="preserve">nebula3d/preprocessing/</w:t>
             </w:r>
           </w:p>
         </w:tc>
@@ -2863,7 +2825,7 @@
                 <w:sz w:val="18"/>
                 <w:szCs w:val="18"/>
               </w:rPr>
-              <w:t xml:space="preserve">ndiff/analysis/</w:t>
+              <w:t xml:space="preserve">nebula3d/analysis/</w:t>
             </w:r>
           </w:p>
         </w:tc>
@@ -2931,7 +2893,7 @@
                 <w:sz w:val="18"/>
                 <w:szCs w:val="18"/>
               </w:rPr>
-              <w:t xml:space="preserve">ndiff/inpainting/</w:t>
+              <w:t xml:space="preserve">nebula3d/inpainting/</w:t>
             </w:r>
           </w:p>
         </w:tc>
@@ -2999,7 +2961,7 @@
                 <w:sz w:val="18"/>
                 <w:szCs w:val="18"/>
               </w:rPr>
-              <w:t xml:space="preserve">ndiff/visualization/</w:t>
+              <w:t xml:space="preserve">nebula3d/visualization/</w:t>
             </w:r>
           </w:p>
         </w:tc>
@@ -3067,7 +3029,7 @@
                 <w:sz w:val="18"/>
                 <w:szCs w:val="18"/>
               </w:rPr>
-              <w:t xml:space="preserve">ndiff/utils/</w:t>
+              <w:t xml:space="preserve">nebula3d/utils/</w:t>
             </w:r>
           </w:p>
         </w:tc>
@@ -3224,7 +3186,7 @@
           <w:sz w:val="21"/>
           <w:szCs w:val="21"/>
         </w:rPr>
-        <w:t xml:space="preserve">Every stage operates on an HKLVolume dataclass defined in src/ndiff/core.py:</w:t>
+        <w:t xml:space="preserve">Every stage operates on an HKLVolume dataclass defined in src/nebula3d/core.py:</w:t>
       </w:r>
     </w:p>
     <w:p>
@@ -3863,7 +3825,7 @@
           <w:sz w:val="21"/>
           <w:szCs w:val="21"/>
         </w:rPr>
-        <w:t xml:space="preserve">Raw input is a Mantid MDHistoWorkspace saved as NeXus (*_cc_sub_bkg.nxs). The reader (ndiff/io/mantid_nxs.py) extracts the signal, variance, mask, bin-edge arrays, and the UB matrix; the crystallographic UB is rescaled by 2π on read.</w:t>
+        <w:t xml:space="preserve">Raw input is a Mantid MDHistoWorkspace saved as NeXus (*_cc_sub_bkg.nxs). The reader (nebula3d/io/mantid_nxs.py) extracts the signal, variance, mask, bin-edge arrays, and the UB matrix; the crystallographic UB is rescaled by 2π on read.</w:t>
       </w:r>
     </w:p>
     <w:p>
@@ -3893,7 +3855,7 @@
           <w:sz w:val="21"/>
           <w:szCs w:val="21"/>
         </w:rPr>
-        <w:t xml:space="preserve">All intermediate and output files are HDF5 (.h5). Load with vol = ndiff.load(path); save with ndiff.save(vol, path). The ΔPDF output also stores the transform configuration and direct-lattice constants as HDF5 attributes for the interactive viewers.</w:t>
+        <w:t xml:space="preserve">All intermediate and output files are HDF5 (.h5). Load with vol = nebula3d.load(path); save with nebula3d.save(vol, path). The ΔPDF output also stores the transform configuration and direct-lattice constants as HDF5 attributes for the interactive viewers.</w:t>
       </w:r>
     </w:p>
     <w:p>
@@ -4420,7 +4382,7 @@
           <w:sz w:val="21"/>
           <w:szCs w:val="21"/>
         </w:rPr>
-        <w:t xml:space="preserve">Implemented in ndiff/analysis/bragg.py by </w:t>
+        <w:t xml:space="preserve">Implemented in nebula3d/analysis/bragg.py by </w:t>
       </w:r>
       <w:r>
         <w:rPr>
@@ -5733,7 +5695,7 @@
                 <w:sz w:val="20"/>
                 <w:szCs w:val="20"/>
               </w:rPr>
-              <w:t xml:space="preserve"> — per-axis Gaussian blur with σH = 0 (slice-wise, preserves H-layering) and σK = σL = 1.5 r.l.u. This is the validated setting for the TbTi₃Bi₄ dataset.</w:t>
+              <w:t xml:space="preserve"> — per-axis Gaussian blur with σH = 0 (slice-wise, preserves H-layering) and σK = σL = 1.5 r.l.u. Tune the blur widths for the smooth background in your volume.</w:t>
             </w:r>
           </w:p>
         </w:tc>
@@ -6579,7 +6541,7 @@
                 <w:sz w:val="18"/>
                 <w:szCs w:val="18"/>
               </w:rPr>
-              <w:t xml:space="preserve">git clone https://github.com/user/neutron-diffuse</w:t>
+              <w:t xml:space="preserve">git clone https://github.com/user/nebula3d</w:t>
             </w:r>
           </w:p>
           <w:p>
@@ -6593,7 +6555,7 @@
                 <w:sz w:val="18"/>
                 <w:szCs w:val="18"/>
               </w:rPr>
-              <w:t xml:space="preserve">cd neutron-diffuse</w:t>
+              <w:t xml:space="preserve">cd nebula3d</w:t>
             </w:r>
           </w:p>
           <w:p>
@@ -6742,7 +6704,7 @@
                 <w:sz w:val="18"/>
                 <w:szCs w:val="18"/>
               </w:rPr>
-              <w:t xml:space="preserve">export MPLCONFIGDIR=/private/tmp/ndiff-mpl</w:t>
+              <w:t xml:space="preserve">export MPLCONFIGDIR=/private/tmp/nebula3d-mpl</w:t>
             </w:r>
           </w:p>
         </w:tc>
@@ -6863,7 +6825,7 @@
                 <w:sz w:val="18"/>
                 <w:szCs w:val="18"/>
               </w:rPr>
-              <w:t xml:space="preserve">PYTHONPATH=src python -c "import ndiff; print(ndiff.__version__)"</w:t>
+              <w:t xml:space="preserve">PYTHONPATH=src python -c "import nebula3d; print(nebula3d.__version__)"</w:t>
             </w:r>
           </w:p>
           <w:p>
@@ -8120,7 +8082,7 @@
           <w:sz w:val="28"/>
           <w:szCs w:val="28"/>
         </w:rPr>
-        <w:t xml:space="preserve">Multi-Temperature Workflow</w:t>
+        <w:t xml:space="preserve">Multi-Volume Workflow</w:t>
       </w:r>
     </w:p>
     <w:p>
@@ -8134,45 +8096,7 @@
           <w:sz w:val="21"/>
           <w:szCs w:val="21"/>
         </w:rPr>
-        <w:t xml:space="preserve">TbTi</w:t>
-      </w:r>
-      <w:r>
-        <w:rPr>
-          <w:rFonts w:ascii="Arial" w:cs="Arial" w:eastAsia="Arial" w:hAnsi="Arial"/>
-          <w:color w:val="1C1F26"/>
-          <w:sz w:val="21"/>
-          <w:szCs w:val="21"/>
-          <w:vertAlign w:val="subscript"/>
-        </w:rPr>
-        <w:t xml:space="preserve">3</w:t>
-      </w:r>
-      <w:r>
-        <w:rPr>
-          <w:rFonts w:ascii="Arial" w:cs="Arial" w:eastAsia="Arial" w:hAnsi="Arial"/>
-          <w:color w:val="1C1F26"/>
-          <w:sz w:val="21"/>
-          <w:szCs w:val="21"/>
-        </w:rPr>
-        <w:t xml:space="preserve">Bi</w:t>
-      </w:r>
-      <w:r>
-        <w:rPr>
-          <w:rFonts w:ascii="Arial" w:cs="Arial" w:eastAsia="Arial" w:hAnsi="Arial"/>
-          <w:color w:val="1C1F26"/>
-          <w:sz w:val="21"/>
-          <w:szCs w:val="21"/>
-          <w:vertAlign w:val="subscript"/>
-        </w:rPr>
-        <w:t xml:space="preserve">4</w:t>
-      </w:r>
-      <w:r>
-        <w:rPr>
-          <w:rFonts w:ascii="Arial" w:cs="Arial" w:eastAsia="Arial" w:hAnsi="Arial"/>
-          <w:color w:val="1C1F26"/>
-          <w:sz w:val="21"/>
-          <w:szCs w:val="21"/>
-        </w:rPr>
-        <w:t xml:space="preserve"> is processed at three temperatures by pointing DATA_FILE at each raw volume:</w:t>
+        <w:t xml:space="preserve">Run the pipeline once per input volume by pointing DATA_FILE at each raw volume:</w:t>
       </w:r>
     </w:p>
     <w:p>
@@ -8237,7 +8161,7 @@
                 <w:sz w:val="18"/>
                 <w:szCs w:val="18"/>
               </w:rPr>
-              <w:t xml:space="preserve"># 22 K  (auto-detected default)</w:t>
+              <w:t xml:space="preserve"># condition A</w:t>
             </w:r>
           </w:p>
           <w:p>
@@ -8251,7 +8175,7 @@
                 <w:sz w:val="18"/>
                 <w:szCs w:val="18"/>
               </w:rPr>
-              <w:t xml:space="preserve">NO_VIEWER=1 python examples/run_pipeline.py</w:t>
+              <w:t xml:space="preserve">NO_VIEWER=1 DATA_FILE="data/raw/condition_a_cc_sub_bkg.nxs" \</w:t>
             </w:r>
           </w:p>
           <w:p>
@@ -8265,6 +8189,20 @@
                 <w:sz w:val="18"/>
                 <w:szCs w:val="18"/>
               </w:rPr>
+              <w:t xml:space="preserve">  python examples/run_pipeline.py</w:t>
+            </w:r>
+          </w:p>
+          <w:p>
+            <w:pPr>
+              <w:spacing w:after="0" w:before="0" w:line="248" w:lineRule="auto"/>
+            </w:pPr>
+            <w:r>
+              <w:rPr>
+                <w:rFonts w:ascii="Courier New" w:cs="Courier New" w:eastAsia="Courier New" w:hAnsi="Courier New"/>
+                <w:color w:val="16213A"/>
+                <w:sz w:val="18"/>
+                <w:szCs w:val="18"/>
+              </w:rPr>
               <w:t xml:space="preserve"> </w:t>
             </w:r>
           </w:p>
@@ -8279,7 +8217,7 @@
                 <w:sz w:val="18"/>
                 <w:szCs w:val="18"/>
               </w:rPr>
-              <w:t xml:space="preserve"># 45 K</w:t>
+              <w:t xml:space="preserve"># condition B</w:t>
             </w:r>
           </w:p>
           <w:p>
@@ -8293,7 +8231,7 @@
                 <w:sz w:val="18"/>
                 <w:szCs w:val="18"/>
               </w:rPr>
-              <w:t xml:space="preserve">NO_VIEWER=1 DATA_FILE="data/raw/TbTi3Bi4_45K_..._cc_sub_bkg.nxs" \</w:t>
+              <w:t xml:space="preserve">NO_VIEWER=1 DATA_FILE="data/raw/condition_b_cc_sub_bkg.nxs" \</w:t>
             </w:r>
           </w:p>
           <w:p>
@@ -8335,7 +8273,7 @@
                 <w:sz w:val="18"/>
                 <w:szCs w:val="18"/>
               </w:rPr>
-              <w:t xml:space="preserve"># 100 K</w:t>
+              <w:t xml:space="preserve"># condition C</w:t>
             </w:r>
           </w:p>
           <w:p>
@@ -8349,7 +8287,7 @@
                 <w:sz w:val="18"/>
                 <w:szCs w:val="18"/>
               </w:rPr>
-              <w:t xml:space="preserve">NO_VIEWER=1 DATA_FILE="data/raw/TbTi3Bi4_100K_..._cc_sub_bkg.nxs" \</w:t>
+              <w:t xml:space="preserve">NO_VIEWER=1 DATA_FILE="data/raw/condition_c_cc_sub_bkg.nxs" \</w:t>
             </w:r>
           </w:p>
           <w:p>
@@ -8470,7 +8408,7 @@
                 <w:sz w:val="18"/>
                 <w:szCs w:val="18"/>
               </w:rPr>
-              <w:t xml:space="preserve">import ndiff</w:t>
+              <w:t xml:space="preserve">import nebula3d</w:t>
             </w:r>
           </w:p>
           <w:p>
@@ -8484,7 +8422,7 @@
                 <w:sz w:val="18"/>
                 <w:szCs w:val="18"/>
               </w:rPr>
-              <w:t xml:space="preserve">from ndiff.analysis import BraggRemover, backfill_bragg, compute_delta_pdf</w:t>
+              <w:t xml:space="preserve">from nebula3d.analysis import BraggRemover, backfill_bragg, compute_delta_pdf</w:t>
             </w:r>
           </w:p>
           <w:p>
@@ -8512,7 +8450,7 @@
                 <w:sz w:val="18"/>
                 <w:szCs w:val="18"/>
               </w:rPr>
-              <w:t xml:space="preserve">vol = ndiff.load("data/processed/sample_ringremoved.h5")</w:t>
+              <w:t xml:space="preserve">vol = nebula3d.load("data/processed/sample_ringremoved.h5")</w:t>
             </w:r>
           </w:p>
           <w:p>
@@ -8778,7 +8716,7 @@
                 <w:sz w:val="18"/>
                 <w:szCs w:val="18"/>
               </w:rPr>
-              <w:t xml:space="preserve">ndiff.save(dpdf, "output_delta_pdf.h5")</w:t>
+              <w:t xml:space="preserve">nebula3d.save(dpdf, "output_delta_pdf.h5")</w:t>
             </w:r>
           </w:p>
         </w:tc>
@@ -13366,7 +13304,7 @@
           <w:sz w:val="21"/>
           <w:szCs w:val="21"/>
         </w:rPr>
-        <w:t xml:space="preserve">All functions live in ndiff.visualization and work identically in scripts, IPython, and Jupyter:</w:t>
+        <w:t xml:space="preserve">All functions live in nebula3d.visualization and work identically in scripts, IPython, and Jupyter:</w:t>
       </w:r>
     </w:p>
     <w:p>
@@ -13431,7 +13369,7 @@
                 <w:sz w:val="18"/>
                 <w:szCs w:val="18"/>
               </w:rPr>
-              <w:t xml:space="preserve">from ndiff.visualization import (</w:t>
+              <w:t xml:space="preserve">from nebula3d.visualization import (</w:t>
             </w:r>
           </w:p>
           <w:p>
@@ -14748,7 +14686,7 @@
                 <w:sz w:val="18"/>
                 <w:szCs w:val="18"/>
               </w:rPr>
-              <w:t xml:space="preserve">  PDF_FILE=data/processed/TbTi3Bi4_22K_mmm_delta_pdf.h5 RMAX=50 \</w:t>
+              <w:t xml:space="preserve">  PDF_FILE=data/processed/condition_a_delta_pdf.h5 RMAX=50 \</w:t>
             </w:r>
           </w:p>
           <w:p>
@@ -14793,7 +14731,7 @@
           <w:sz w:val="23"/>
           <w:szCs w:val="23"/>
         </w:rPr>
-        <w:t xml:space="preserve">Multi-temperature comparison grid</w:t>
+        <w:t xml:space="preserve">Multi-volume comparison grid</w:t>
       </w:r>
     </w:p>
     <w:p>
@@ -14807,7 +14745,7 @@
           <w:sz w:val="21"/>
           <w:szCs w:val="21"/>
         </w:rPr>
-        <w:t xml:space="preserve">A 3×3 grid — rows 22 K / 45 K / 100 K, columns the three orthogonal cuts — with shared cut sliders and one global colour scale:</w:t>
+        <w:t xml:space="preserve">A 3×3 grid — rows are three related volumes, columns are the three orthogonal cuts — with shared cut sliders and one global colour scale:</w:t>
       </w:r>
     </w:p>
     <w:p>
@@ -14886,7 +14824,7 @@
                 <w:sz w:val="18"/>
                 <w:szCs w:val="18"/>
               </w:rPr>
-              <w:t xml:space="preserve">  PDF_22K=data/processed/TbTi3Bi4_22K_mmm_delta_pdf.h5 \</w:t>
+              <w:t xml:space="preserve">  PDF_FILES=data/processed/condition_a_delta_pdf.h5,data/processed/condition_b_delta_pdf.h5,data/processed/condition_c_delta_pdf.h5 \</w:t>
             </w:r>
           </w:p>
           <w:p>
@@ -14900,21 +14838,7 @@
                 <w:sz w:val="18"/>
                 <w:szCs w:val="18"/>
               </w:rPr>
-              <w:t xml:space="preserve">  PDF_45K=data/processed/TbTi3Bi4_45K_delta_pdf.h5 \</w:t>
-            </w:r>
-          </w:p>
-          <w:p>
-            <w:pPr>
-              <w:spacing w:after="0" w:before="0" w:line="248" w:lineRule="auto"/>
-            </w:pPr>
-            <w:r>
-              <w:rPr>
-                <w:rFonts w:ascii="Courier New" w:cs="Courier New" w:eastAsia="Courier New" w:hAnsi="Courier New"/>
-                <w:color w:val="16213A"/>
-                <w:sz w:val="18"/>
-                <w:szCs w:val="18"/>
-              </w:rPr>
-              <w:t xml:space="preserve">  PDF_100K=data/processed/TbTi3Bi4_100K_delta_pdf.h5 \</w:t>
+              <w:t xml:space="preserve">  PDF_LABELS="condition A,condition B,condition C" \</w:t>
             </w:r>
           </w:p>
           <w:p>
@@ -15072,7 +14996,7 @@
                 <w:sz w:val="18"/>
                 <w:szCs w:val="18"/>
               </w:rPr>
-              <w:t xml:space="preserve">import ndiff</w:t>
+              <w:t xml:space="preserve">import nebula3d</w:t>
             </w:r>
           </w:p>
           <w:p>
@@ -15086,7 +15010,7 @@
                 <w:sz w:val="18"/>
                 <w:szCs w:val="18"/>
               </w:rPr>
-              <w:t xml:space="preserve">from ndiff.visualization import plot_overview</w:t>
+              <w:t xml:space="preserve">from nebula3d.visualization import plot_overview</w:t>
             </w:r>
           </w:p>
           <w:p>
@@ -15114,7 +15038,7 @@
                 <w:sz w:val="18"/>
                 <w:szCs w:val="18"/>
               </w:rPr>
-              <w:t xml:space="preserve">vol = ndiff.load("path/to/sample.nxs")</w:t>
+              <w:t xml:space="preserve">vol = nebula3d.load("path/to/sample.nxs")</w:t>
             </w:r>
           </w:p>
           <w:p>
@@ -15249,7 +15173,7 @@
                 <w:sz w:val="18"/>
                 <w:szCs w:val="18"/>
               </w:rPr>
-              <w:t xml:space="preserve">from ndiff.visualization import plot_radial_profile, plot_azimuthal_map</w:t>
+              <w:t xml:space="preserve">from nebula3d.visualization import plot_radial_profile, plot_azimuthal_map</w:t>
             </w:r>
           </w:p>
           <w:p>
@@ -15468,7 +15392,7 @@
                 <w:sz w:val="18"/>
                 <w:szCs w:val="18"/>
               </w:rPr>
-              <w:t xml:space="preserve">import ndiff</w:t>
+              <w:t xml:space="preserve">import nebula3d</w:t>
             </w:r>
           </w:p>
           <w:p>
@@ -15482,7 +15406,7 @@
                 <w:sz w:val="18"/>
                 <w:szCs w:val="18"/>
               </w:rPr>
-              <w:t xml:space="preserve">from ndiff.visualization import plot_slice</w:t>
+              <w:t xml:space="preserve">from nebula3d.visualization import plot_slice</w:t>
             </w:r>
           </w:p>
           <w:p>
@@ -15524,7 +15448,7 @@
                 <w:sz w:val="18"/>
                 <w:szCs w:val="18"/>
               </w:rPr>
-              <w:t xml:space="preserve">punched = ndiff.load("data/processed/..._braggpunched.h5")</w:t>
+              <w:t xml:space="preserve">punched = nebula3d.load("data/processed/..._braggpunched.h5")</w:t>
             </w:r>
           </w:p>
           <w:p>
@@ -15771,7 +15695,7 @@
                 <w:sz w:val="18"/>
                 <w:szCs w:val="18"/>
               </w:rPr>
-              <w:t xml:space="preserve">import ndiff</w:t>
+              <w:t xml:space="preserve">import nebula3d</w:t>
             </w:r>
           </w:p>
           <w:p>
@@ -15785,7 +15709,7 @@
                 <w:sz w:val="18"/>
                 <w:szCs w:val="18"/>
               </w:rPr>
-              <w:t xml:space="preserve">from ndiff.analysis import compute_delta_pdf</w:t>
+              <w:t xml:space="preserve">from nebula3d.analysis import compute_delta_pdf</w:t>
             </w:r>
           </w:p>
           <w:p>
@@ -15827,7 +15751,7 @@
                 <w:sz w:val="18"/>
                 <w:szCs w:val="18"/>
               </w:rPr>
-              <w:t xml:space="preserve">filled = ndiff.load("data/processed/..._backfilled.h5")</w:t>
+              <w:t xml:space="preserve">filled = nebula3d.load("data/processed/..._backfilled.h5")</w:t>
             </w:r>
           </w:p>
           <w:p>
@@ -15897,7 +15821,7 @@
                 <w:sz w:val="18"/>
                 <w:szCs w:val="18"/>
               </w:rPr>
-              <w:t xml:space="preserve">ndiff.save(dpdf, "output_delta_pdf.h5")</w:t>
+              <w:t xml:space="preserve">nebula3d.save(dpdf, "output_delta_pdf.h5")</w:t>
             </w:r>
           </w:p>
           <w:p>
@@ -16293,7 +16217,7 @@
                 <w:sz w:val="18"/>
                 <w:szCs w:val="18"/>
               </w:rPr>
-              <w:t xml:space="preserve">python -m mypy src/ndiff --ignore-missing-imports</w:t>
+              <w:t xml:space="preserve">python -m mypy src/nebula3d --ignore-missing-imports</w:t>
             </w:r>
           </w:p>
         </w:tc>
@@ -19773,7 +19697,7 @@
         <w:sz w:val="15"/>
         <w:szCs w:val="15"/>
       </w:rPr>
-      <w:t xml:space="preserve">neutron-diffuse</w:t>
+      <w:t xml:space="preserve">nebula3d</w:t>
     </w:r>
   </w:p>
 </w:ftr>
@@ -19843,7 +19767,7 @@
         <w:sz w:val="16"/>
         <w:szCs w:val="16"/>
       </w:rPr>
-      <w:t xml:space="preserve">neutron-diffuse</w:t>
+      <w:t xml:space="preserve">nebula3d</w:t>
     </w:r>
     <w:r>
       <w:rPr>

</xml_diff>